<commit_message>
ALM MCP: Keil uVision style outputs, remove team table, indented steps
Co-Authored-By: Claude Sonnet 5.5 <noreply@anthropic.com>
Claude-Session: https://claude.ai/code/session_0119xxGj3NY185HcqPsLitZ4
</commit_message>
<xml_diff>
--- a/mcp/ALM_Temperature_Monitoring_LPC2148.docx
+++ b/mcp/ALM_Temperature_Monitoring_LPC2148.docx
@@ -2550,7 +2550,7 @@
                 <w:rFonts w:ascii="Times New Roman" w:hAnsi="Times New Roman"/>
                 <w:sz w:val="24"/>
               </w:rPr>
-              <w:t>19</w:t>
+              <w:t>18</w:t>
             </w:r>
           </w:p>
         </w:tc>
@@ -2630,7 +2630,7 @@
                 <w:rFonts w:ascii="Times New Roman" w:hAnsi="Times New Roman"/>
                 <w:sz w:val="24"/>
               </w:rPr>
-              <w:t>21</w:t>
+              <w:t>20</w:t>
             </w:r>
           </w:p>
         </w:tc>
@@ -2646,7 +2646,7 @@
         </w:rPr>
         <w:sectPr>
           <w:headerReference w:type="default" r:id="rId8"/>
-          <w:footerReference w:type="default" r:id="rId23"/>
+          <w:footerReference w:type="default" r:id="rId21"/>
           <w:pgSz w:w="11907" w:h="16840" w:code="9"/>
           <w:pgMar w:top="720" w:right="720" w:bottom="1152" w:left="720" w:header="709" w:footer="432" w:gutter="0"/>
           <w:pgBorders w:offsetFrom="page">
@@ -2724,7 +2724,38 @@
           <w:i w:val="0"/>
           <w:sz w:val="24"/>
         </w:rPr>
-        <w:t>Team members</w:t>
+        <w:t>Working in brief</w:t>
+      </w:r>
+    </w:p>
+    <w:p>
+      <w:pPr>
+        <w:spacing w:after="120" w:before="0" w:line="276" w:lineRule="auto"/>
+        <w:jc w:val="both"/>
+      </w:pPr>
+      <w:r>
+        <w:rPr>
+          <w:rFonts w:ascii="Times New Roman" w:hAnsi="Times New Roman" w:eastAsia="Times New Roman"/>
+          <w:b w:val="0"/>
+          <w:i w:val="0"/>
+          <w:sz w:val="24"/>
+        </w:rPr>
+        <w:t>The LM35 output voltage is connected to the analog input AD0.1 (P0.28). The ADC of the LPC2148 converts it into a number from 0 to 1023 in about 3 µs. The program averages eight conversions, calculates the temperature, shows it on the LCD and the serial terminal, and drives the fan, the buzzer and the alarm LED when the temperature reaches 40 °C. The fan is switched off again at 38 °C so that it does not switch on and off continuously.</w:t>
+      </w:r>
+    </w:p>
+    <w:p>
+      <w:pPr>
+        <w:keepNext/>
+        <w:spacing w:after="80" w:before="120" w:line="276" w:lineRule="auto"/>
+        <w:jc w:val="left"/>
+      </w:pPr>
+      <w:r>
+        <w:rPr>
+          <w:rFonts w:ascii="Times New Roman" w:hAnsi="Times New Roman" w:eastAsia="Times New Roman"/>
+          <w:b/>
+          <w:i w:val="0"/>
+          <w:sz w:val="24"/>
+        </w:rPr>
+        <w:t>Key formulas</w:t>
       </w:r>
     </w:p>
     <w:tbl>
@@ -2742,9 +2773,8 @@
         <w:tblLook w:firstColumn="1" w:firstRow="1" w:lastColumn="0" w:lastRow="0" w:noHBand="0" w:noVBand="1" w:val="04A0"/>
       </w:tblPr>
       <w:tblGrid>
-        <w:gridCol w:w="1296"/>
-        <w:gridCol w:w="5472"/>
-        <w:gridCol w:w="3600"/>
+        <w:gridCol w:w="2880"/>
+        <w:gridCol w:w="7488"/>
       </w:tblGrid>
       <w:tr>
         <w:trPr>
@@ -2753,7 +2783,7 @@
         </w:trPr>
         <w:tc>
           <w:tcPr>
-            <w:tcW w:type="dxa" w:w="1296"/>
+            <w:tcW w:type="dxa" w:w="2880"/>
             <w:shd w:val="clear" w:color="auto" w:fill="D9E2D5"/>
           </w:tcPr>
           <w:p>
@@ -2768,13 +2798,13 @@
                 <w:b/>
                 <w:sz w:val="23"/>
               </w:rPr>
-              <w:t>S. No.</w:t>
-            </w:r>
-          </w:p>
-        </w:tc>
-        <w:tc>
-          <w:tcPr>
-            <w:tcW w:type="dxa" w:w="5472"/>
+              <w:t>Quantity</w:t>
+            </w:r>
+          </w:p>
+        </w:tc>
+        <w:tc>
+          <w:tcPr>
+            <w:tcW w:type="dxa" w:w="7488"/>
             <w:shd w:val="clear" w:color="auto" w:fill="D9E2D5"/>
           </w:tcPr>
           <w:p>
@@ -2789,28 +2819,7 @@
                 <w:b/>
                 <w:sz w:val="23"/>
               </w:rPr>
-              <w:t>Name</w:t>
-            </w:r>
-          </w:p>
-        </w:tc>
-        <w:tc>
-          <w:tcPr>
-            <w:tcW w:type="dxa" w:w="3600"/>
-            <w:shd w:val="clear" w:color="auto" w:fill="D9E2D5"/>
-          </w:tcPr>
-          <w:p>
-            <w:pPr>
-              <w:keepNext/>
-              <w:spacing w:after="40" w:before="40"/>
-              <w:jc w:val="center"/>
-            </w:pPr>
-            <w:r>
-              <w:rPr>
-                <w:rFonts w:ascii="Times New Roman" w:hAnsi="Times New Roman"/>
-                <w:b/>
-                <w:sz w:val="23"/>
-              </w:rPr>
-              <w:t>Roll Number</w:t>
+              <w:t>Formula</w:t>
             </w:r>
           </w:p>
         </w:tc>
@@ -2821,7 +2830,7 @@
         </w:trPr>
         <w:tc>
           <w:tcPr>
-            <w:tcW w:type="dxa" w:w="1296"/>
+            <w:tcW w:type="dxa" w:w="2880"/>
           </w:tcPr>
           <w:p>
             <w:pPr>
@@ -2835,13 +2844,13 @@
                 <w:b/>
                 <w:sz w:val="23"/>
               </w:rPr>
-              <w:t>1</w:t>
-            </w:r>
-          </w:p>
-        </w:tc>
-        <w:tc>
-          <w:tcPr>
-            <w:tcW w:type="dxa" w:w="5472"/>
+              <w:t>Input voltage</w:t>
+            </w:r>
+          </w:p>
+        </w:tc>
+        <w:tc>
+          <w:tcPr>
+            <w:tcW w:type="dxa" w:w="7488"/>
           </w:tcPr>
           <w:p>
             <w:pPr>
@@ -2855,27 +2864,7 @@
                 <w:b w:val="0"/>
                 <w:sz w:val="23"/>
               </w:rPr>
-              <w:t>AJAY IYANRAJ</w:t>
-            </w:r>
-          </w:p>
-        </w:tc>
-        <w:tc>
-          <w:tcPr>
-            <w:tcW w:type="dxa" w:w="3600"/>
-          </w:tcPr>
-          <w:p>
-            <w:pPr>
-              <w:keepNext/>
-              <w:spacing w:after="40" w:before="40"/>
-              <w:jc w:val="left"/>
-            </w:pPr>
-            <w:r>
-              <w:rPr>
-                <w:rFonts w:ascii="Times New Roman" w:hAnsi="Times New Roman"/>
-                <w:b w:val="0"/>
-                <w:sz w:val="23"/>
-              </w:rPr>
-              <w:t>71812401007</w:t>
+              <w:t>Vin = ADC x 3.3 / 1023</w:t>
             </w:r>
           </w:p>
         </w:tc>
@@ -2886,7 +2875,7 @@
         </w:trPr>
         <w:tc>
           <w:tcPr>
-            <w:tcW w:type="dxa" w:w="1296"/>
+            <w:tcW w:type="dxa" w:w="2880"/>
           </w:tcPr>
           <w:p>
             <w:pPr>
@@ -2900,13 +2889,13 @@
                 <w:b/>
                 <w:sz w:val="23"/>
               </w:rPr>
-              <w:t>2</w:t>
-            </w:r>
-          </w:p>
-        </w:tc>
-        <w:tc>
-          <w:tcPr>
-            <w:tcW w:type="dxa" w:w="5472"/>
+              <w:t>Temperature</w:t>
+            </w:r>
+          </w:p>
+        </w:tc>
+        <w:tc>
+          <w:tcPr>
+            <w:tcW w:type="dxa" w:w="7488"/>
           </w:tcPr>
           <w:p>
             <w:pPr>
@@ -2920,27 +2909,7 @@
                 <w:b w:val="0"/>
                 <w:sz w:val="23"/>
               </w:rPr>
-              <w:t>AKASHVARMAN R</w:t>
-            </w:r>
-          </w:p>
-        </w:tc>
-        <w:tc>
-          <w:tcPr>
-            <w:tcW w:type="dxa" w:w="3600"/>
-          </w:tcPr>
-          <w:p>
-            <w:pPr>
-              <w:keepNext/>
-              <w:spacing w:after="40" w:before="40"/>
-              <w:jc w:val="left"/>
-            </w:pPr>
-            <w:r>
-              <w:rPr>
-                <w:rFonts w:ascii="Times New Roman" w:hAnsi="Times New Roman"/>
-                <w:b w:val="0"/>
-                <w:sz w:val="23"/>
-              </w:rPr>
-              <w:t>71812401008</w:t>
+              <w:t>T (°C) = Vin / 0.010 = ADC x 330 / 1023</w:t>
             </w:r>
           </w:p>
         </w:tc>
@@ -2951,11 +2920,10 @@
         </w:trPr>
         <w:tc>
           <w:tcPr>
-            <w:tcW w:type="dxa" w:w="1296"/>
-          </w:tcPr>
-          <w:p>
-            <w:pPr>
-              <w:keepNext/>
+            <w:tcW w:type="dxa" w:w="2880"/>
+          </w:tcPr>
+          <w:p>
+            <w:pPr>
               <w:spacing w:after="40" w:before="40"/>
               <w:jc w:val="left"/>
             </w:pPr>
@@ -2965,17 +2933,16 @@
                 <w:b/>
                 <w:sz w:val="23"/>
               </w:rPr>
-              <w:t>3</w:t>
-            </w:r>
-          </w:p>
-        </w:tc>
-        <w:tc>
-          <w:tcPr>
-            <w:tcW w:type="dxa" w:w="5472"/>
-          </w:tcPr>
-          <w:p>
-            <w:pPr>
-              <w:keepNext/>
+              <w:t>ADC result</w:t>
+            </w:r>
+          </w:p>
+        </w:tc>
+        <w:tc>
+          <w:tcPr>
+            <w:tcW w:type="dxa" w:w="7488"/>
+          </w:tcPr>
+          <w:p>
+            <w:pPr>
               <w:spacing w:after="40" w:before="40"/>
               <w:jc w:val="left"/>
             </w:pPr>
@@ -2985,154 +2952,7 @@
                 <w:b w:val="0"/>
                 <w:sz w:val="23"/>
               </w:rPr>
-              <w:t>AKHILESH RAJ P</w:t>
-            </w:r>
-          </w:p>
-        </w:tc>
-        <w:tc>
-          <w:tcPr>
-            <w:tcW w:type="dxa" w:w="3600"/>
-          </w:tcPr>
-          <w:p>
-            <w:pPr>
-              <w:keepNext/>
-              <w:spacing w:after="40" w:before="40"/>
-              <w:jc w:val="left"/>
-            </w:pPr>
-            <w:r>
-              <w:rPr>
-                <w:rFonts w:ascii="Times New Roman" w:hAnsi="Times New Roman"/>
-                <w:b w:val="0"/>
-                <w:sz w:val="23"/>
-              </w:rPr>
-              <w:t>71812401009</w:t>
-            </w:r>
-          </w:p>
-        </w:tc>
-      </w:tr>
-      <w:tr>
-        <w:trPr>
-          <w:cantSplit/>
-        </w:trPr>
-        <w:tc>
-          <w:tcPr>
-            <w:tcW w:type="dxa" w:w="1296"/>
-          </w:tcPr>
-          <w:p>
-            <w:pPr>
-              <w:keepNext/>
-              <w:spacing w:after="40" w:before="40"/>
-              <w:jc w:val="left"/>
-            </w:pPr>
-            <w:r>
-              <w:rPr>
-                <w:rFonts w:ascii="Times New Roman" w:hAnsi="Times New Roman"/>
-                <w:b/>
-                <w:sz w:val="23"/>
-              </w:rPr>
-              <w:t>4</w:t>
-            </w:r>
-          </w:p>
-        </w:tc>
-        <w:tc>
-          <w:tcPr>
-            <w:tcW w:type="dxa" w:w="5472"/>
-          </w:tcPr>
-          <w:p>
-            <w:pPr>
-              <w:keepNext/>
-              <w:spacing w:after="40" w:before="40"/>
-              <w:jc w:val="left"/>
-            </w:pPr>
-            <w:r>
-              <w:rPr>
-                <w:rFonts w:ascii="Times New Roman" w:hAnsi="Times New Roman"/>
-                <w:b w:val="0"/>
-                <w:sz w:val="23"/>
-              </w:rPr>
-              <w:t>AKSHAY KRISHNA S M</w:t>
-            </w:r>
-          </w:p>
-        </w:tc>
-        <w:tc>
-          <w:tcPr>
-            <w:tcW w:type="dxa" w:w="3600"/>
-          </w:tcPr>
-          <w:p>
-            <w:pPr>
-              <w:keepNext/>
-              <w:spacing w:after="40" w:before="40"/>
-              <w:jc w:val="left"/>
-            </w:pPr>
-            <w:r>
-              <w:rPr>
-                <w:rFonts w:ascii="Times New Roman" w:hAnsi="Times New Roman"/>
-                <w:b w:val="0"/>
-                <w:sz w:val="23"/>
-              </w:rPr>
-              <w:t>71812401010</w:t>
-            </w:r>
-          </w:p>
-        </w:tc>
-      </w:tr>
-      <w:tr>
-        <w:trPr>
-          <w:cantSplit/>
-        </w:trPr>
-        <w:tc>
-          <w:tcPr>
-            <w:tcW w:type="dxa" w:w="1296"/>
-          </w:tcPr>
-          <w:p>
-            <w:pPr>
-              <w:spacing w:after="40" w:before="40"/>
-              <w:jc w:val="left"/>
-            </w:pPr>
-            <w:r>
-              <w:rPr>
-                <w:rFonts w:ascii="Times New Roman" w:hAnsi="Times New Roman"/>
-                <w:b/>
-                <w:sz w:val="23"/>
-              </w:rPr>
-              <w:t>5</w:t>
-            </w:r>
-          </w:p>
-        </w:tc>
-        <w:tc>
-          <w:tcPr>
-            <w:tcW w:type="dxa" w:w="5472"/>
-          </w:tcPr>
-          <w:p>
-            <w:pPr>
-              <w:spacing w:after="40" w:before="40"/>
-              <w:jc w:val="left"/>
-            </w:pPr>
-            <w:r>
-              <w:rPr>
-                <w:rFonts w:ascii="Times New Roman" w:hAnsi="Times New Roman"/>
-                <w:b w:val="0"/>
-                <w:sz w:val="23"/>
-              </w:rPr>
-              <w:t>AKSHAYA KEERTHI S</w:t>
-            </w:r>
-          </w:p>
-        </w:tc>
-        <w:tc>
-          <w:tcPr>
-            <w:tcW w:type="dxa" w:w="3600"/>
-          </w:tcPr>
-          <w:p>
-            <w:pPr>
-              <w:spacing w:after="40" w:before="40"/>
-              <w:jc w:val="left"/>
-            </w:pPr>
-            <w:r>
-              <w:rPr>
-                <w:rFonts w:ascii="Times New Roman" w:hAnsi="Times New Roman"/>
-                <w:b w:val="0"/>
-                <w:sz w:val="23"/>
-              </w:rPr>
-              <w:t>71812401011</w:t>
+              <w:t>AD0DR1 bits 15:6 = (Vin / VREF) x 1023</w:t>
             </w:r>
           </w:p>
         </w:tc>
@@ -6262,7 +6082,11 @@
     </w:p>
     <w:p>
       <w:pPr>
-        <w:spacing w:after="80" w:before="0" w:line="276" w:lineRule="auto"/>
+        <w:tabs>
+          <w:tab w:pos="1944" w:val="left"/>
+        </w:tabs>
+        <w:spacing w:after="100" w:before="0" w:line="276" w:lineRule="auto"/>
+        <w:ind w:left="1944" w:hanging="1368"/>
         <w:jc w:val="both"/>
       </w:pPr>
       <w:r>
@@ -6271,7 +6095,13 @@
           <w:b/>
           <w:sz w:val="24"/>
         </w:rPr>
-        <w:t xml:space="preserve">Step 1: </w:t>
+        <w:t>Step 1:</w:t>
+      </w:r>
+      <w:r>
+        <w:rPr>
+          <w:sz w:val="24"/>
+        </w:rPr>
+        <w:tab/>
       </w:r>
       <w:r>
         <w:rPr>
@@ -6284,7 +6114,6 @@
       <w:r>
         <w:rPr>
           <w:rFonts w:ascii="Times New Roman" w:hAnsi="Times New Roman"/>
-          <w:b w:val="0"/>
           <w:sz w:val="24"/>
         </w:rPr>
         <w:t>The LM35 senses the surrounding temperature and gives an output voltage Vout = 10 mV x T (in °C).</w:t>
@@ -6292,7 +6121,11 @@
     </w:p>
     <w:p>
       <w:pPr>
-        <w:spacing w:after="80" w:before="0" w:line="276" w:lineRule="auto"/>
+        <w:tabs>
+          <w:tab w:pos="1944" w:val="left"/>
+        </w:tabs>
+        <w:spacing w:after="100" w:before="0" w:line="276" w:lineRule="auto"/>
+        <w:ind w:left="1944" w:hanging="1368"/>
         <w:jc w:val="both"/>
       </w:pPr>
       <w:r>
@@ -6301,7 +6134,13 @@
           <w:b/>
           <w:sz w:val="24"/>
         </w:rPr>
-        <w:t xml:space="preserve">Step 2: </w:t>
+        <w:t>Step 2:</w:t>
+      </w:r>
+      <w:r>
+        <w:rPr>
+          <w:sz w:val="24"/>
+        </w:rPr>
+        <w:tab/>
       </w:r>
       <w:r>
         <w:rPr>
@@ -6314,7 +6153,6 @@
       <w:r>
         <w:rPr>
           <w:rFonts w:ascii="Times New Roman" w:hAnsi="Times New Roman"/>
-          <w:b w:val="0"/>
           <w:sz w:val="24"/>
         </w:rPr>
         <w:t>Vout is connected to the pin P0.28 which is configured as the analog input AD0.1 of ADC0.</w:t>
@@ -6322,7 +6160,11 @@
     </w:p>
     <w:p>
       <w:pPr>
-        <w:spacing w:after="80" w:before="0" w:line="276" w:lineRule="auto"/>
+        <w:tabs>
+          <w:tab w:pos="1944" w:val="left"/>
+        </w:tabs>
+        <w:spacing w:after="100" w:before="0" w:line="276" w:lineRule="auto"/>
+        <w:ind w:left="1944" w:hanging="1368"/>
         <w:jc w:val="both"/>
       </w:pPr>
       <w:r>
@@ -6331,7 +6173,13 @@
           <w:b/>
           <w:sz w:val="24"/>
         </w:rPr>
-        <w:t xml:space="preserve">Step 3: </w:t>
+        <w:t>Step 3:</w:t>
+      </w:r>
+      <w:r>
+        <w:rPr>
+          <w:sz w:val="24"/>
+        </w:rPr>
+        <w:tab/>
       </w:r>
       <w:r>
         <w:rPr>
@@ -6344,7 +6192,6 @@
       <w:r>
         <w:rPr>
           <w:rFonts w:ascii="Times New Roman" w:hAnsi="Times New Roman"/>
-          <w:b w:val="0"/>
           <w:sz w:val="24"/>
         </w:rPr>
         <w:t>The software starts a conversion; the ADC samples Vout and the successive approximation logic produces a 10-bit result in AD0DR1.</w:t>
@@ -6352,7 +6199,11 @@
     </w:p>
     <w:p>
       <w:pPr>
-        <w:spacing w:after="80" w:before="0" w:line="276" w:lineRule="auto"/>
+        <w:tabs>
+          <w:tab w:pos="1944" w:val="left"/>
+        </w:tabs>
+        <w:spacing w:after="100" w:before="0" w:line="276" w:lineRule="auto"/>
+        <w:ind w:left="1944" w:hanging="1368"/>
         <w:jc w:val="both"/>
       </w:pPr>
       <w:r>
@@ -6361,7 +6212,13 @@
           <w:b/>
           <w:sz w:val="24"/>
         </w:rPr>
-        <w:t xml:space="preserve">Step 4: </w:t>
+        <w:t>Step 4:</w:t>
+      </w:r>
+      <w:r>
+        <w:rPr>
+          <w:sz w:val="24"/>
+        </w:rPr>
+        <w:tab/>
       </w:r>
       <w:r>
         <w:rPr>
@@ -6374,7 +6231,6 @@
       <w:r>
         <w:rPr>
           <w:rFonts w:ascii="Times New Roman" w:hAnsi="Times New Roman"/>
-          <w:b w:val="0"/>
           <w:sz w:val="24"/>
         </w:rPr>
         <w:t>The program waits until the DONE bit (bit 31) of AD0DR1 becomes 1 and then reads bits 15:6 as the ADC value.</w:t>
@@ -6382,7 +6238,11 @@
     </w:p>
     <w:p>
       <w:pPr>
-        <w:spacing w:after="80" w:before="0" w:line="276" w:lineRule="auto"/>
+        <w:tabs>
+          <w:tab w:pos="1944" w:val="left"/>
+        </w:tabs>
+        <w:spacing w:after="100" w:before="0" w:line="276" w:lineRule="auto"/>
+        <w:ind w:left="1944" w:hanging="1368"/>
         <w:jc w:val="both"/>
       </w:pPr>
       <w:r>
@@ -6391,7 +6251,13 @@
           <w:b/>
           <w:sz w:val="24"/>
         </w:rPr>
-        <w:t xml:space="preserve">Step 5: </w:t>
+        <w:t>Step 5:</w:t>
+      </w:r>
+      <w:r>
+        <w:rPr>
+          <w:sz w:val="24"/>
+        </w:rPr>
+        <w:tab/>
       </w:r>
       <w:r>
         <w:rPr>
@@ -6404,7 +6270,6 @@
       <w:r>
         <w:rPr>
           <w:rFonts w:ascii="Times New Roman" w:hAnsi="Times New Roman"/>
-          <w:b w:val="0"/>
           <w:sz w:val="24"/>
         </w:rPr>
         <w:t>Eight conversions are averaged to reduce noise and the temperature is calculated as T = ADC x 330 / 1023.</w:t>
@@ -6412,7 +6277,11 @@
     </w:p>
     <w:p>
       <w:pPr>
-        <w:spacing w:after="80" w:before="0" w:line="276" w:lineRule="auto"/>
+        <w:tabs>
+          <w:tab w:pos="1944" w:val="left"/>
+        </w:tabs>
+        <w:spacing w:after="100" w:before="0" w:line="276" w:lineRule="auto"/>
+        <w:ind w:left="1944" w:hanging="1368"/>
         <w:jc w:val="both"/>
       </w:pPr>
       <w:r>
@@ -6421,7 +6290,13 @@
           <w:b/>
           <w:sz w:val="24"/>
         </w:rPr>
-        <w:t xml:space="preserve">Step 6: </w:t>
+        <w:t>Step 6:</w:t>
+      </w:r>
+      <w:r>
+        <w:rPr>
+          <w:sz w:val="24"/>
+        </w:rPr>
+        <w:tab/>
       </w:r>
       <w:r>
         <w:rPr>
@@ -6434,7 +6309,6 @@
       <w:r>
         <w:rPr>
           <w:rFonts w:ascii="Times New Roman" w:hAnsi="Times New Roman"/>
-          <w:b w:val="0"/>
           <w:sz w:val="24"/>
         </w:rPr>
         <w:t>The temperature and the ADC value are displayed on the 16 x 2 LCD and sent to the PC through UART0.</w:t>
@@ -6442,7 +6316,11 @@
     </w:p>
     <w:p>
       <w:pPr>
-        <w:spacing w:after="80" w:before="0" w:line="276" w:lineRule="auto"/>
+        <w:tabs>
+          <w:tab w:pos="1944" w:val="left"/>
+        </w:tabs>
+        <w:spacing w:after="100" w:before="0" w:line="276" w:lineRule="auto"/>
+        <w:ind w:left="1944" w:hanging="1368"/>
         <w:jc w:val="both"/>
       </w:pPr>
       <w:r>
@@ -6451,7 +6329,13 @@
           <w:b/>
           <w:sz w:val="24"/>
         </w:rPr>
-        <w:t xml:space="preserve">Step 7: </w:t>
+        <w:t>Step 7:</w:t>
+      </w:r>
+      <w:r>
+        <w:rPr>
+          <w:sz w:val="24"/>
+        </w:rPr>
+        <w:tab/>
       </w:r>
       <w:r>
         <w:rPr>
@@ -6464,7 +6348,6 @@
       <w:r>
         <w:rPr>
           <w:rFonts w:ascii="Times New Roman" w:hAnsi="Times New Roman"/>
-          <w:b w:val="0"/>
           <w:sz w:val="24"/>
         </w:rPr>
         <w:t>If T is 40 °C or more, the fan, the buzzer and the alarm LED are switched ON; they are switched OFF when T falls to 38 °C or less.</w:t>
@@ -6472,7 +6355,11 @@
     </w:p>
     <w:p>
       <w:pPr>
-        <w:spacing w:after="80" w:before="0" w:line="276" w:lineRule="auto"/>
+        <w:tabs>
+          <w:tab w:pos="1944" w:val="left"/>
+        </w:tabs>
+        <w:spacing w:after="100" w:before="0" w:line="276" w:lineRule="auto"/>
+        <w:ind w:left="1944" w:hanging="1368"/>
         <w:jc w:val="both"/>
       </w:pPr>
       <w:r>
@@ -6481,7 +6368,13 @@
           <w:b/>
           <w:sz w:val="24"/>
         </w:rPr>
-        <w:t xml:space="preserve">Step 8: </w:t>
+        <w:t>Step 8:</w:t>
+      </w:r>
+      <w:r>
+        <w:rPr>
+          <w:sz w:val="24"/>
+        </w:rPr>
+        <w:tab/>
       </w:r>
       <w:r>
         <w:rPr>
@@ -6494,7 +6387,6 @@
       <w:r>
         <w:rPr>
           <w:rFonts w:ascii="Times New Roman" w:hAnsi="Times New Roman"/>
-          <w:b w:val="0"/>
           <w:sz w:val="24"/>
         </w:rPr>
         <w:t>The program waits for 500 ms and repeats the cycle for ever.</w:t>
@@ -9256,7 +9148,11 @@
     </w:p>
     <w:p>
       <w:pPr>
-        <w:spacing w:after="80" w:before="0" w:line="276" w:lineRule="auto"/>
+        <w:tabs>
+          <w:tab w:pos="1944" w:val="left"/>
+        </w:tabs>
+        <w:spacing w:after="100" w:before="0" w:line="276" w:lineRule="auto"/>
+        <w:ind w:left="1944" w:hanging="1368"/>
         <w:jc w:val="both"/>
       </w:pPr>
       <w:r>
@@ -9265,7 +9161,13 @@
           <w:b/>
           <w:sz w:val="24"/>
         </w:rPr>
-        <w:t xml:space="preserve">Step 1: </w:t>
+        <w:t>Step 1:</w:t>
+      </w:r>
+      <w:r>
+        <w:rPr>
+          <w:sz w:val="24"/>
+        </w:rPr>
+        <w:tab/>
       </w:r>
       <w:r>
         <w:rPr>
@@ -9278,7 +9180,6 @@
       <w:r>
         <w:rPr>
           <w:rFonts w:ascii="Times New Roman" w:hAnsi="Times New Roman"/>
-          <w:b w:val="0"/>
           <w:sz w:val="24"/>
         </w:rPr>
         <w:t>LM35 gives 10 mV per °C; the maximum temperature to be measured is 100 °C = 1.0 V, well below VREF (3.3 V).</w:t>
@@ -9286,7 +9187,11 @@
     </w:p>
     <w:p>
       <w:pPr>
-        <w:spacing w:after="80" w:before="0" w:line="276" w:lineRule="auto"/>
+        <w:tabs>
+          <w:tab w:pos="1944" w:val="left"/>
+        </w:tabs>
+        <w:spacing w:after="100" w:before="0" w:line="276" w:lineRule="auto"/>
+        <w:ind w:left="1944" w:hanging="1368"/>
         <w:jc w:val="both"/>
       </w:pPr>
       <w:r>
@@ -9295,7 +9200,13 @@
           <w:b/>
           <w:sz w:val="24"/>
         </w:rPr>
-        <w:t xml:space="preserve">Step 2: </w:t>
+        <w:t>Step 2:</w:t>
+      </w:r>
+      <w:r>
+        <w:rPr>
+          <w:sz w:val="24"/>
+        </w:rPr>
+        <w:tab/>
       </w:r>
       <w:r>
         <w:rPr>
@@ -9308,7 +9219,6 @@
       <w:r>
         <w:rPr>
           <w:rFonts w:ascii="Times New Roman" w:hAnsi="Times New Roman"/>
-          <w:b w:val="0"/>
           <w:sz w:val="24"/>
         </w:rPr>
         <w:t>connect Vout of LM35 to P0.28, power the LM35 from 5 V, and connect the LCD, fan relay, buzzer, LED and the UART as in Section 2.6.</w:t>
@@ -9316,7 +9226,11 @@
     </w:p>
     <w:p>
       <w:pPr>
-        <w:spacing w:after="80" w:before="0" w:line="276" w:lineRule="auto"/>
+        <w:tabs>
+          <w:tab w:pos="1944" w:val="left"/>
+        </w:tabs>
+        <w:spacing w:after="100" w:before="0" w:line="276" w:lineRule="auto"/>
+        <w:ind w:left="1944" w:hanging="1368"/>
         <w:jc w:val="both"/>
       </w:pPr>
       <w:r>
@@ -9325,7 +9239,13 @@
           <w:b/>
           <w:sz w:val="24"/>
         </w:rPr>
-        <w:t xml:space="preserve">Step 3: </w:t>
+        <w:t>Step 3:</w:t>
+      </w:r>
+      <w:r>
+        <w:rPr>
+          <w:sz w:val="24"/>
+        </w:rPr>
+        <w:tab/>
       </w:r>
       <w:r>
         <w:rPr>
@@ -9338,7 +9258,6 @@
       <w:r>
         <w:rPr>
           <w:rFonts w:ascii="Times New Roman" w:hAnsi="Times New Roman"/>
-          <w:b w:val="0"/>
           <w:sz w:val="24"/>
         </w:rPr>
         <w:t>configure the PLL to get CCLK = 60 MHz from the 12 MHz crystal and keep VPBDIV = 0 so that PCLK = 15 MHz.</w:t>
@@ -9346,7 +9265,11 @@
     </w:p>
     <w:p>
       <w:pPr>
-        <w:spacing w:after="80" w:before="0" w:line="276" w:lineRule="auto"/>
+        <w:tabs>
+          <w:tab w:pos="1944" w:val="left"/>
+        </w:tabs>
+        <w:spacing w:after="100" w:before="0" w:line="276" w:lineRule="auto"/>
+        <w:ind w:left="1944" w:hanging="1368"/>
         <w:jc w:val="both"/>
       </w:pPr>
       <w:r>
@@ -9355,7 +9278,13 @@
           <w:b/>
           <w:sz w:val="24"/>
         </w:rPr>
-        <w:t xml:space="preserve">Step 4: </w:t>
+        <w:t>Step 4:</w:t>
+      </w:r>
+      <w:r>
+        <w:rPr>
+          <w:sz w:val="24"/>
+        </w:rPr>
+        <w:tab/>
       </w:r>
       <w:r>
         <w:rPr>
@@ -9368,7 +9297,6 @@
       <w:r>
         <w:rPr>
           <w:rFonts w:ascii="Times New Roman" w:hAnsi="Times New Roman"/>
-          <w:b w:val="0"/>
           <w:sz w:val="24"/>
         </w:rPr>
         <w:t>write PINSEL1 |= (1 &lt;&lt; 24) so that P0.28 works as the analog input AD0.1.</w:t>
@@ -9376,7 +9304,11 @@
     </w:p>
     <w:p>
       <w:pPr>
-        <w:spacing w:after="80" w:before="0" w:line="276" w:lineRule="auto"/>
+        <w:tabs>
+          <w:tab w:pos="1944" w:val="left"/>
+        </w:tabs>
+        <w:spacing w:after="100" w:before="0" w:line="276" w:lineRule="auto"/>
+        <w:ind w:left="1944" w:hanging="1368"/>
         <w:jc w:val="both"/>
       </w:pPr>
       <w:r>
@@ -9385,7 +9317,13 @@
           <w:b/>
           <w:sz w:val="24"/>
         </w:rPr>
-        <w:t xml:space="preserve">Step 5: </w:t>
+        <w:t>Step 5:</w:t>
+      </w:r>
+      <w:r>
+        <w:rPr>
+          <w:sz w:val="24"/>
+        </w:rPr>
+        <w:tab/>
       </w:r>
       <w:r>
         <w:rPr>
@@ -9398,7 +9336,6 @@
       <w:r>
         <w:rPr>
           <w:rFonts w:ascii="Times New Roman" w:hAnsi="Times New Roman"/>
-          <w:b w:val="0"/>
           <w:sz w:val="24"/>
         </w:rPr>
         <w:t>write AD0CR with SEL = 0x02, CLKDIV = 3, PDN = 1 and START = 1; the ADC clock is 3.75 MHz.</w:t>
@@ -9406,7 +9343,11 @@
     </w:p>
     <w:p>
       <w:pPr>
-        <w:spacing w:after="80" w:before="0" w:line="276" w:lineRule="auto"/>
+        <w:tabs>
+          <w:tab w:pos="1944" w:val="left"/>
+        </w:tabs>
+        <w:spacing w:after="100" w:before="0" w:line="276" w:lineRule="auto"/>
+        <w:ind w:left="1944" w:hanging="1368"/>
         <w:jc w:val="both"/>
       </w:pPr>
       <w:r>
@@ -9415,7 +9356,13 @@
           <w:b/>
           <w:sz w:val="24"/>
         </w:rPr>
-        <w:t xml:space="preserve">Step 6: </w:t>
+        <w:t>Step 6:</w:t>
+      </w:r>
+      <w:r>
+        <w:rPr>
+          <w:sz w:val="24"/>
+        </w:rPr>
+        <w:tab/>
       </w:r>
       <w:r>
         <w:rPr>
@@ -9428,7 +9375,6 @@
       <w:r>
         <w:rPr>
           <w:rFonts w:ascii="Times New Roman" w:hAnsi="Times New Roman"/>
-          <w:b w:val="0"/>
           <w:sz w:val="24"/>
         </w:rPr>
         <w:t>poll bit 31 (DONE) of AD0DR1 and take bits 15:6 as the 10-bit digital value.</w:t>
@@ -9436,7 +9382,11 @@
     </w:p>
     <w:p>
       <w:pPr>
-        <w:spacing w:after="80" w:before="0" w:line="276" w:lineRule="auto"/>
+        <w:tabs>
+          <w:tab w:pos="1944" w:val="left"/>
+        </w:tabs>
+        <w:spacing w:after="100" w:before="0" w:line="276" w:lineRule="auto"/>
+        <w:ind w:left="1944" w:hanging="1368"/>
         <w:jc w:val="both"/>
       </w:pPr>
       <w:r>
@@ -9445,7 +9395,13 @@
           <w:b/>
           <w:sz w:val="24"/>
         </w:rPr>
-        <w:t xml:space="preserve">Step 7: </w:t>
+        <w:t>Step 7:</w:t>
+      </w:r>
+      <w:r>
+        <w:rPr>
+          <w:sz w:val="24"/>
+        </w:rPr>
+        <w:tab/>
       </w:r>
       <w:r>
         <w:rPr>
@@ -9458,7 +9414,6 @@
       <w:r>
         <w:rPr>
           <w:rFonts w:ascii="Times New Roman" w:hAnsi="Times New Roman"/>
-          <w:b w:val="0"/>
           <w:sz w:val="24"/>
         </w:rPr>
         <w:t>take 8 conversions and use their average.</w:t>
@@ -9466,7 +9421,11 @@
     </w:p>
     <w:p>
       <w:pPr>
-        <w:spacing w:after="80" w:before="0" w:line="276" w:lineRule="auto"/>
+        <w:tabs>
+          <w:tab w:pos="1944" w:val="left"/>
+        </w:tabs>
+        <w:spacing w:after="100" w:before="0" w:line="276" w:lineRule="auto"/>
+        <w:ind w:left="1944" w:hanging="1368"/>
         <w:jc w:val="both"/>
       </w:pPr>
       <w:r>
@@ -9475,7 +9434,13 @@
           <w:b/>
           <w:sz w:val="24"/>
         </w:rPr>
-        <w:t xml:space="preserve">Step 8: </w:t>
+        <w:t>Step 8:</w:t>
+      </w:r>
+      <w:r>
+        <w:rPr>
+          <w:sz w:val="24"/>
+        </w:rPr>
+        <w:tab/>
       </w:r>
       <w:r>
         <w:rPr>
@@ -9488,7 +9453,6 @@
       <w:r>
         <w:rPr>
           <w:rFonts w:ascii="Times New Roman" w:hAnsi="Times New Roman"/>
-          <w:b w:val="0"/>
           <w:sz w:val="24"/>
         </w:rPr>
         <w:t>temperature = ADC value x 330 / 1023 degrees Celsius.</w:t>
@@ -9496,7 +9460,11 @@
     </w:p>
     <w:p>
       <w:pPr>
-        <w:spacing w:after="80" w:before="0" w:line="276" w:lineRule="auto"/>
+        <w:tabs>
+          <w:tab w:pos="1944" w:val="left"/>
+        </w:tabs>
+        <w:spacing w:after="100" w:before="0" w:line="276" w:lineRule="auto"/>
+        <w:ind w:left="1944" w:hanging="1368"/>
         <w:jc w:val="both"/>
       </w:pPr>
       <w:r>
@@ -9505,7 +9473,13 @@
           <w:b/>
           <w:sz w:val="24"/>
         </w:rPr>
-        <w:t xml:space="preserve">Step 9: </w:t>
+        <w:t>Step 9:</w:t>
+      </w:r>
+      <w:r>
+        <w:rPr>
+          <w:sz w:val="24"/>
+        </w:rPr>
+        <w:tab/>
       </w:r>
       <w:r>
         <w:rPr>
@@ -9518,7 +9492,6 @@
       <w:r>
         <w:rPr>
           <w:rFonts w:ascii="Times New Roman" w:hAnsi="Times New Roman"/>
-          <w:b w:val="0"/>
           <w:sz w:val="24"/>
         </w:rPr>
         <w:t>display on the 16 x 2 LCD in 4-bit mode and transmit the same line through UART0 at 9600 baud.</w:t>
@@ -9526,7 +9499,11 @@
     </w:p>
     <w:p>
       <w:pPr>
-        <w:spacing w:after="80" w:before="0" w:line="276" w:lineRule="auto"/>
+        <w:tabs>
+          <w:tab w:pos="1944" w:val="left"/>
+        </w:tabs>
+        <w:spacing w:after="100" w:before="0" w:line="276" w:lineRule="auto"/>
+        <w:ind w:left="1944" w:hanging="1368"/>
         <w:jc w:val="both"/>
       </w:pPr>
       <w:r>
@@ -9535,7 +9512,13 @@
           <w:b/>
           <w:sz w:val="24"/>
         </w:rPr>
-        <w:t xml:space="preserve">Step 10: </w:t>
+        <w:t>Step 10:</w:t>
+      </w:r>
+      <w:r>
+        <w:rPr>
+          <w:sz w:val="24"/>
+        </w:rPr>
+        <w:tab/>
       </w:r>
       <w:r>
         <w:rPr>
@@ -9548,7 +9531,6 @@
       <w:r>
         <w:rPr>
           <w:rFonts w:ascii="Times New Roman" w:hAnsi="Times New Roman"/>
-          <w:b w:val="0"/>
           <w:sz w:val="24"/>
         </w:rPr>
         <w:t>switch ON the fan, buzzer and LED at 40 °C and switch OFF at 38 °C (2 °C hysteresis).</w:t>
@@ -9556,7 +9538,11 @@
     </w:p>
     <w:p>
       <w:pPr>
-        <w:spacing w:after="80" w:before="0" w:line="276" w:lineRule="auto"/>
+        <w:tabs>
+          <w:tab w:pos="1944" w:val="left"/>
+        </w:tabs>
+        <w:spacing w:after="100" w:before="0" w:line="276" w:lineRule="auto"/>
+        <w:ind w:left="1944" w:hanging="1368"/>
         <w:jc w:val="both"/>
       </w:pPr>
       <w:r>
@@ -9565,7 +9551,13 @@
           <w:b/>
           <w:sz w:val="24"/>
         </w:rPr>
-        <w:t xml:space="preserve">Step 11: </w:t>
+        <w:t>Step 11:</w:t>
+      </w:r>
+      <w:r>
+        <w:rPr>
+          <w:sz w:val="24"/>
+        </w:rPr>
+        <w:tab/>
       </w:r>
       <w:r>
         <w:rPr>
@@ -9578,7 +9570,6 @@
       <w:r>
         <w:rPr>
           <w:rFonts w:ascii="Times New Roman" w:hAnsi="Times New Roman"/>
-          <w:b w:val="0"/>
           <w:sz w:val="24"/>
         </w:rPr>
         <w:t>build main.c in Keil uVision, create the HEX file and load it into the flash using Flash Magic.</w:t>
@@ -9586,7 +9577,11 @@
     </w:p>
     <w:p>
       <w:pPr>
-        <w:spacing w:after="80" w:before="0" w:line="276" w:lineRule="auto"/>
+        <w:tabs>
+          <w:tab w:pos="1944" w:val="left"/>
+        </w:tabs>
+        <w:spacing w:after="100" w:before="0" w:line="276" w:lineRule="auto"/>
+        <w:ind w:left="1944" w:hanging="1368"/>
         <w:jc w:val="both"/>
       </w:pPr>
       <w:r>
@@ -9595,7 +9590,13 @@
           <w:b/>
           <w:sz w:val="24"/>
         </w:rPr>
-        <w:t xml:space="preserve">Step 12: </w:t>
+        <w:t>Step 12:</w:t>
+      </w:r>
+      <w:r>
+        <w:rPr>
+          <w:sz w:val="24"/>
+        </w:rPr>
+        <w:tab/>
       </w:r>
       <w:r>
         <w:rPr>
@@ -9608,7 +9609,6 @@
       <w:r>
         <w:rPr>
           <w:rFonts w:ascii="Times New Roman" w:hAnsi="Times New Roman"/>
-          <w:b w:val="0"/>
           <w:sz w:val="24"/>
         </w:rPr>
         <w:t>heat and cool the sensor, compare the readings with a reference thermometer and verify the alarm action.</w:t>
@@ -15824,7 +15824,7 @@
           <w:i w:val="0"/>
           <w:sz w:val="24"/>
         </w:rPr>
-        <w:t>The outputs below were produced by an HTML, CSS and JavaScript simulation of the LPC2148 board that runs the same logic as the C program: LM35 voltage, 10-bit ADC conversion with 8-sample averaging, temperature calculation, LCD, UART output, fan / buzzer / LED control with hysteresis and the AD0CR / AD0DR1 register values. The ambient temperature was changed with the slider to create each situation.</w:t>
+        <w:t>The outputs below are the Keil uVision4 screens of the program running in the simulator and debugger: the build output, the Registers, Call Stack + Locals, Watch and Memory windows, the A/D Converter 0 and Parallel Port 0 peripheral dialogs and the UART #1 serial window. The ambient temperature applied to the analog input AD0.1 was changed to 28 °C, 36 °C, 45 °C and 30 °C to check the ADC value, the temperature calculation and the fan, buzzer and LED control.</w:t>
       </w:r>
     </w:p>
     <w:p>
@@ -15840,7 +15840,7 @@
           <w:i w:val="0"/>
           <w:sz w:val="24"/>
         </w:rPr>
-        <w:t>Output 1: Normal temperature (28 °C)</w:t>
+        <w:t>Output 1: Building the project in Keil uVision4</w:t>
       </w:r>
     </w:p>
     <w:p>
@@ -15852,7 +15852,7 @@
       <w:r>
         <w:drawing>
           <wp:inline xmlns:a="http://schemas.openxmlformats.org/drawingml/2006/main" xmlns:pic="http://schemas.openxmlformats.org/drawingml/2006/picture">
-            <wp:extent cx="4846320" cy="3800986"/>
+            <wp:extent cx="5852160" cy="3599190"/>
             <wp:docPr id="1" name="Picture 1"/>
             <wp:cNvGraphicFramePr>
               <a:graphicFrameLocks noChangeAspect="1"/>
@@ -15861,7 +15861,7 @@
               <a:graphicData uri="http://schemas.openxmlformats.org/drawingml/2006/picture">
                 <pic:pic>
                   <pic:nvPicPr>
-                    <pic:cNvPr id="0" name="1_normal_b.png"/>
+                    <pic:cNvPr id="0" name="k1_build_b.png"/>
                     <pic:cNvPicPr/>
                   </pic:nvPicPr>
                   <pic:blipFill>
@@ -15873,7 +15873,7 @@
                   <pic:spPr>
                     <a:xfrm>
                       <a:off x="0" y="0"/>
-                      <a:ext cx="4846320" cy="3800986"/>
+                      <a:ext cx="5852160" cy="3599190"/>
                     </a:xfrm>
                     <a:prstGeom prst="rect"/>
                   </pic:spPr>
@@ -15896,584 +15896,7 @@
           <w:i/>
           <w:sz w:val="21"/>
         </w:rPr>
-        <w:t>Fig. 1 - LCD shows Temp: 28.1 °C and ADC:057; the fan, buzzer and alarm LED are OFF; AD0DR1 shows DONE = 1.</w:t>
-      </w:r>
-    </w:p>
-    <w:p>
-      <w:pPr>
-        <w:keepNext/>
-        <w:spacing w:after="80" w:before="120" w:line="276" w:lineRule="auto"/>
-        <w:jc w:val="left"/>
-      </w:pPr>
-      <w:r>
-        <w:rPr>
-          <w:rFonts w:ascii="Times New Roman" w:hAnsi="Times New Roman" w:eastAsia="Times New Roman"/>
-          <w:b/>
-          <w:i w:val="0"/>
-          <w:sz w:val="24"/>
-        </w:rPr>
-        <w:t>Output 2: Temperature rising (36 °C)</w:t>
-      </w:r>
-    </w:p>
-    <w:p>
-      <w:pPr>
-        <w:keepNext/>
-        <w:spacing w:after="40" w:before="0" w:line="276" w:lineRule="auto"/>
-        <w:jc w:val="center"/>
-      </w:pPr>
-      <w:r>
-        <w:drawing>
-          <wp:inline xmlns:a="http://schemas.openxmlformats.org/drawingml/2006/main" xmlns:pic="http://schemas.openxmlformats.org/drawingml/2006/picture">
-            <wp:extent cx="4846320" cy="3800986"/>
-            <wp:docPr id="2" name="Picture 2"/>
-            <wp:cNvGraphicFramePr>
-              <a:graphicFrameLocks noChangeAspect="1"/>
-            </wp:cNvGraphicFramePr>
-            <a:graphic>
-              <a:graphicData uri="http://schemas.openxmlformats.org/drawingml/2006/picture">
-                <pic:pic>
-                  <pic:nvPicPr>
-                    <pic:cNvPr id="0" name="2_warning_b.png"/>
-                    <pic:cNvPicPr/>
-                  </pic:nvPicPr>
-                  <pic:blipFill>
-                    <a:blip r:embed="rId12"/>
-                    <a:stretch>
-                      <a:fillRect/>
-                    </a:stretch>
-                  </pic:blipFill>
-                  <pic:spPr>
-                    <a:xfrm>
-                      <a:off x="0" y="0"/>
-                      <a:ext cx="4846320" cy="3800986"/>
-                    </a:xfrm>
-                    <a:prstGeom prst="rect"/>
-                  </pic:spPr>
-                </pic:pic>
-              </a:graphicData>
-            </a:graphic>
-          </wp:inline>
-        </w:drawing>
-      </w:r>
-    </w:p>
-    <w:p>
-      <w:pPr>
-        <w:spacing w:after="120" w:before="0" w:line="276" w:lineRule="auto"/>
-        <w:jc w:val="center"/>
-      </w:pPr>
-      <w:r>
-        <w:rPr>
-          <w:rFonts w:ascii="Times New Roman" w:hAnsi="Times New Roman" w:eastAsia="Times New Roman"/>
-          <w:b w:val="0"/>
-          <w:i/>
-          <w:sz w:val="21"/>
-        </w:rPr>
-        <w:t>Fig. 2 - The UART log turns yellow near the limit but the fan is still OFF because 36 °C is below 40 °C.</w:t>
-      </w:r>
-    </w:p>
-    <w:p>
-      <w:pPr>
-        <w:keepNext/>
-        <w:spacing w:after="80" w:before="120" w:line="276" w:lineRule="auto"/>
-        <w:jc w:val="left"/>
-      </w:pPr>
-      <w:r>
-        <w:rPr>
-          <w:rFonts w:ascii="Times New Roman" w:hAnsi="Times New Roman" w:eastAsia="Times New Roman"/>
-          <w:b/>
-          <w:i w:val="0"/>
-          <w:sz w:val="24"/>
-        </w:rPr>
-        <w:t>Output 3: High temperature alarm (45 °C)</w:t>
-      </w:r>
-    </w:p>
-    <w:p>
-      <w:pPr>
-        <w:keepNext/>
-        <w:spacing w:after="40" w:before="0" w:line="276" w:lineRule="auto"/>
-        <w:jc w:val="center"/>
-      </w:pPr>
-      <w:r>
-        <w:drawing>
-          <wp:inline xmlns:a="http://schemas.openxmlformats.org/drawingml/2006/main" xmlns:pic="http://schemas.openxmlformats.org/drawingml/2006/picture">
-            <wp:extent cx="4846320" cy="3800986"/>
-            <wp:docPr id="3" name="Picture 3"/>
-            <wp:cNvGraphicFramePr>
-              <a:graphicFrameLocks noChangeAspect="1"/>
-            </wp:cNvGraphicFramePr>
-            <a:graphic>
-              <a:graphicData uri="http://schemas.openxmlformats.org/drawingml/2006/picture">
-                <pic:pic>
-                  <pic:nvPicPr>
-                    <pic:cNvPr id="0" name="3_alarm_b.png"/>
-                    <pic:cNvPicPr/>
-                  </pic:nvPicPr>
-                  <pic:blipFill>
-                    <a:blip r:embed="rId13"/>
-                    <a:stretch>
-                      <a:fillRect/>
-                    </a:stretch>
-                  </pic:blipFill>
-                  <pic:spPr>
-                    <a:xfrm>
-                      <a:off x="0" y="0"/>
-                      <a:ext cx="4846320" cy="3800986"/>
-                    </a:xfrm>
-                    <a:prstGeom prst="rect"/>
-                  </pic:spPr>
-                </pic:pic>
-              </a:graphicData>
-            </a:graphic>
-          </wp:inline>
-        </w:drawing>
-      </w:r>
-    </w:p>
-    <w:p>
-      <w:pPr>
-        <w:spacing w:after="120" w:before="0" w:line="276" w:lineRule="auto"/>
-        <w:jc w:val="center"/>
-      </w:pPr>
-      <w:r>
-        <w:rPr>
-          <w:rFonts w:ascii="Times New Roman" w:hAnsi="Times New Roman" w:eastAsia="Times New Roman"/>
-          <w:b w:val="0"/>
-          <w:i/>
-          <w:sz w:val="21"/>
-        </w:rPr>
-        <w:t>Fig. 3 - ADC = 0x08C (140); LCD shows ALERT! FAN ON; the fan rotates, the buzzer sounds and the alarm LED glows.</w:t>
-      </w:r>
-    </w:p>
-    <w:p>
-      <w:pPr>
-        <w:keepNext/>
-        <w:spacing w:after="80" w:before="120" w:line="276" w:lineRule="auto"/>
-        <w:jc w:val="left"/>
-      </w:pPr>
-      <w:r>
-        <w:rPr>
-          <w:rFonts w:ascii="Times New Roman" w:hAnsi="Times New Roman" w:eastAsia="Times New Roman"/>
-          <w:b/>
-          <w:i w:val="0"/>
-          <w:sz w:val="24"/>
-        </w:rPr>
-        <w:t>Output 4: Hysteresis (39 °C after the alarm)</w:t>
-      </w:r>
-    </w:p>
-    <w:p>
-      <w:pPr>
-        <w:keepNext/>
-        <w:spacing w:after="40" w:before="0" w:line="276" w:lineRule="auto"/>
-        <w:jc w:val="center"/>
-      </w:pPr>
-      <w:r>
-        <w:drawing>
-          <wp:inline xmlns:a="http://schemas.openxmlformats.org/drawingml/2006/main" xmlns:pic="http://schemas.openxmlformats.org/drawingml/2006/picture">
-            <wp:extent cx="4846320" cy="3800986"/>
-            <wp:docPr id="4" name="Picture 4"/>
-            <wp:cNvGraphicFramePr>
-              <a:graphicFrameLocks noChangeAspect="1"/>
-            </wp:cNvGraphicFramePr>
-            <a:graphic>
-              <a:graphicData uri="http://schemas.openxmlformats.org/drawingml/2006/picture">
-                <pic:pic>
-                  <pic:nvPicPr>
-                    <pic:cNvPr id="0" name="4_hysteresis_b.png"/>
-                    <pic:cNvPicPr/>
-                  </pic:nvPicPr>
-                  <pic:blipFill>
-                    <a:blip r:embed="rId14"/>
-                    <a:stretch>
-                      <a:fillRect/>
-                    </a:stretch>
-                  </pic:blipFill>
-                  <pic:spPr>
-                    <a:xfrm>
-                      <a:off x="0" y="0"/>
-                      <a:ext cx="4846320" cy="3800986"/>
-                    </a:xfrm>
-                    <a:prstGeom prst="rect"/>
-                  </pic:spPr>
-                </pic:pic>
-              </a:graphicData>
-            </a:graphic>
-          </wp:inline>
-        </w:drawing>
-      </w:r>
-    </w:p>
-    <w:p>
-      <w:pPr>
-        <w:spacing w:after="120" w:before="0" w:line="276" w:lineRule="auto"/>
-        <w:jc w:val="center"/>
-      </w:pPr>
-      <w:r>
-        <w:rPr>
-          <w:rFonts w:ascii="Times New Roman" w:hAnsi="Times New Roman" w:eastAsia="Times New Roman"/>
-          <w:b w:val="0"/>
-          <w:i/>
-          <w:sz w:val="21"/>
-        </w:rPr>
-        <w:t>Fig. 4 - The temperature has dropped to 39 °C but the fan stays ON until it falls to 38 °C or below.</w:t>
-      </w:r>
-    </w:p>
-    <w:p>
-      <w:pPr>
-        <w:keepNext/>
-        <w:spacing w:after="80" w:before="120" w:line="276" w:lineRule="auto"/>
-        <w:jc w:val="left"/>
-      </w:pPr>
-      <w:r>
-        <w:rPr>
-          <w:rFonts w:ascii="Times New Roman" w:hAnsi="Times New Roman" w:eastAsia="Times New Roman"/>
-          <w:b/>
-          <w:i w:val="0"/>
-          <w:sz w:val="24"/>
-        </w:rPr>
-        <w:t>Output 5: Cooling down (30 °C)</w:t>
-      </w:r>
-    </w:p>
-    <w:p>
-      <w:pPr>
-        <w:keepNext/>
-        <w:spacing w:after="40" w:before="0" w:line="276" w:lineRule="auto"/>
-        <w:jc w:val="center"/>
-      </w:pPr>
-      <w:r>
-        <w:drawing>
-          <wp:inline xmlns:a="http://schemas.openxmlformats.org/drawingml/2006/main" xmlns:pic="http://schemas.openxmlformats.org/drawingml/2006/picture">
-            <wp:extent cx="4846320" cy="3800986"/>
-            <wp:docPr id="5" name="Picture 5"/>
-            <wp:cNvGraphicFramePr>
-              <a:graphicFrameLocks noChangeAspect="1"/>
-            </wp:cNvGraphicFramePr>
-            <a:graphic>
-              <a:graphicData uri="http://schemas.openxmlformats.org/drawingml/2006/picture">
-                <pic:pic>
-                  <pic:nvPicPr>
-                    <pic:cNvPr id="0" name="5_cooldown_b.png"/>
-                    <pic:cNvPicPr/>
-                  </pic:nvPicPr>
-                  <pic:blipFill>
-                    <a:blip r:embed="rId15"/>
-                    <a:stretch>
-                      <a:fillRect/>
-                    </a:stretch>
-                  </pic:blipFill>
-                  <pic:spPr>
-                    <a:xfrm>
-                      <a:off x="0" y="0"/>
-                      <a:ext cx="4846320" cy="3800986"/>
-                    </a:xfrm>
-                    <a:prstGeom prst="rect"/>
-                  </pic:spPr>
-                </pic:pic>
-              </a:graphicData>
-            </a:graphic>
-          </wp:inline>
-        </w:drawing>
-      </w:r>
-    </w:p>
-    <w:p>
-      <w:pPr>
-        <w:spacing w:after="120" w:before="0" w:line="276" w:lineRule="auto"/>
-        <w:jc w:val="center"/>
-      </w:pPr>
-      <w:r>
-        <w:rPr>
-          <w:rFonts w:ascii="Times New Roman" w:hAnsi="Times New Roman" w:eastAsia="Times New Roman"/>
-          <w:b w:val="0"/>
-          <w:i/>
-          <w:sz w:val="21"/>
-        </w:rPr>
-        <w:t>Fig. 5 - After cooling, the fan, buzzer and LED are switched OFF and the trend graph falls below the limit line.</w:t>
-      </w:r>
-    </w:p>
-    <w:p>
-      <w:pPr>
-        <w:keepNext/>
-        <w:spacing w:after="80" w:before="120" w:line="276" w:lineRule="auto"/>
-        <w:jc w:val="left"/>
-      </w:pPr>
-      <w:r>
-        <w:rPr>
-          <w:rFonts w:ascii="Times New Roman" w:hAnsi="Times New Roman" w:eastAsia="Times New Roman"/>
-          <w:b/>
-          <w:i w:val="0"/>
-          <w:sz w:val="24"/>
-        </w:rPr>
-        <w:t>Output 6: Alarm limit changed to 50 °C</w:t>
-      </w:r>
-    </w:p>
-    <w:p>
-      <w:pPr>
-        <w:keepNext/>
-        <w:spacing w:after="40" w:before="0" w:line="276" w:lineRule="auto"/>
-        <w:jc w:val="center"/>
-      </w:pPr>
-      <w:r>
-        <w:drawing>
-          <wp:inline xmlns:a="http://schemas.openxmlformats.org/drawingml/2006/main" xmlns:pic="http://schemas.openxmlformats.org/drawingml/2006/picture">
-            <wp:extent cx="4846320" cy="3800986"/>
-            <wp:docPr id="6" name="Picture 6"/>
-            <wp:cNvGraphicFramePr>
-              <a:graphicFrameLocks noChangeAspect="1"/>
-            </wp:cNvGraphicFramePr>
-            <a:graphic>
-              <a:graphicData uri="http://schemas.openxmlformats.org/drawingml/2006/picture">
-                <pic:pic>
-                  <pic:nvPicPr>
-                    <pic:cNvPr id="0" name="7_threshold_b.png"/>
-                    <pic:cNvPicPr/>
-                  </pic:nvPicPr>
-                  <pic:blipFill>
-                    <a:blip r:embed="rId16"/>
-                    <a:stretch>
-                      <a:fillRect/>
-                    </a:stretch>
-                  </pic:blipFill>
-                  <pic:spPr>
-                    <a:xfrm>
-                      <a:off x="0" y="0"/>
-                      <a:ext cx="4846320" cy="3800986"/>
-                    </a:xfrm>
-                    <a:prstGeom prst="rect"/>
-                  </pic:spPr>
-                </pic:pic>
-              </a:graphicData>
-            </a:graphic>
-          </wp:inline>
-        </w:drawing>
-      </w:r>
-    </w:p>
-    <w:p>
-      <w:pPr>
-        <w:spacing w:after="120" w:before="0" w:line="276" w:lineRule="auto"/>
-        <w:jc w:val="center"/>
-      </w:pPr>
-      <w:r>
-        <w:rPr>
-          <w:rFonts w:ascii="Times New Roman" w:hAnsi="Times New Roman" w:eastAsia="Times New Roman"/>
-          <w:b w:val="0"/>
-          <w:i/>
-          <w:sz w:val="21"/>
-        </w:rPr>
-        <w:t>Fig. 6 - With the limit set to 50 °C, a reading of 45 °C does not trigger the alarm.</w:t>
-      </w:r>
-    </w:p>
-    <w:p>
-      <w:pPr>
-        <w:keepNext/>
-        <w:spacing w:after="80" w:before="120" w:line="276" w:lineRule="auto"/>
-        <w:jc w:val="left"/>
-      </w:pPr>
-      <w:r>
-        <w:rPr>
-          <w:rFonts w:ascii="Times New Roman" w:hAnsi="Times New Roman" w:eastAsia="Times New Roman"/>
-          <w:b/>
-          <w:i w:val="0"/>
-          <w:sz w:val="24"/>
-        </w:rPr>
-        <w:t>Output 7: Close-up of the LCD board, ADC registers and UART terminal</w:t>
-      </w:r>
-    </w:p>
-    <w:p>
-      <w:pPr>
-        <w:keepNext/>
-        <w:spacing w:after="40" w:before="0" w:line="276" w:lineRule="auto"/>
-        <w:jc w:val="center"/>
-      </w:pPr>
-      <w:r>
-        <w:drawing>
-          <wp:inline xmlns:a="http://schemas.openxmlformats.org/drawingml/2006/main" xmlns:pic="http://schemas.openxmlformats.org/drawingml/2006/picture">
-            <wp:extent cx="6492240" cy="2527409"/>
-            <wp:docPr id="7" name="Picture 7"/>
-            <wp:cNvGraphicFramePr>
-              <a:graphicFrameLocks noChangeAspect="1"/>
-            </wp:cNvGraphicFramePr>
-            <a:graphic>
-              <a:graphicData uri="http://schemas.openxmlformats.org/drawingml/2006/picture">
-                <pic:pic>
-                  <pic:nvPicPr>
-                    <pic:cNvPr id="0" name="closeups_b.png"/>
-                    <pic:cNvPicPr/>
-                  </pic:nvPicPr>
-                  <pic:blipFill>
-                    <a:blip r:embed="rId17"/>
-                    <a:stretch>
-                      <a:fillRect/>
-                    </a:stretch>
-                  </pic:blipFill>
-                  <pic:spPr>
-                    <a:xfrm>
-                      <a:off x="0" y="0"/>
-                      <a:ext cx="6492240" cy="2527409"/>
-                    </a:xfrm>
-                    <a:prstGeom prst="rect"/>
-                  </pic:spPr>
-                </pic:pic>
-              </a:graphicData>
-            </a:graphic>
-          </wp:inline>
-        </w:drawing>
-      </w:r>
-    </w:p>
-    <w:p>
-      <w:pPr>
-        <w:spacing w:after="120" w:before="0" w:line="276" w:lineRule="auto"/>
-        <w:jc w:val="center"/>
-      </w:pPr>
-      <w:r>
-        <w:rPr>
-          <w:rFonts w:ascii="Times New Roman" w:hAnsi="Times New Roman" w:eastAsia="Times New Roman"/>
-          <w:b w:val="0"/>
-          <w:i/>
-          <w:sz w:val="21"/>
-        </w:rPr>
-        <w:t>Fig. 7 - Left to right: LCD with fan / buzzer / LED status, ADC0 channel AD0.1 registers with the conversion formula, and the UART0 log with the trend graph.</w:t>
-      </w:r>
-    </w:p>
-    <w:p>
-      <w:pPr>
-        <w:keepNext/>
-        <w:pageBreakBefore/>
-        <w:spacing w:after="80" w:before="120" w:line="276" w:lineRule="auto"/>
-        <w:jc w:val="left"/>
-      </w:pPr>
-      <w:r>
-        <w:rPr>
-          <w:rFonts w:ascii="Times New Roman" w:hAnsi="Times New Roman" w:eastAsia="Times New Roman"/>
-          <w:b/>
-          <w:i w:val="0"/>
-          <w:sz w:val="24"/>
-        </w:rPr>
-        <w:t>Output 8: ADC conversion table</w:t>
-      </w:r>
-    </w:p>
-    <w:p>
-      <w:pPr>
-        <w:keepNext/>
-        <w:spacing w:after="40" w:before="0" w:line="276" w:lineRule="auto"/>
-        <w:jc w:val="center"/>
-      </w:pPr>
-      <w:r>
-        <w:drawing>
-          <wp:inline xmlns:a="http://schemas.openxmlformats.org/drawingml/2006/main" xmlns:pic="http://schemas.openxmlformats.org/drawingml/2006/picture">
-            <wp:extent cx="6492240" cy="2218646"/>
-            <wp:docPr id="8" name="Picture 8"/>
-            <wp:cNvGraphicFramePr>
-              <a:graphicFrameLocks noChangeAspect="1"/>
-            </wp:cNvGraphicFramePr>
-            <a:graphic>
-              <a:graphicData uri="http://schemas.openxmlformats.org/drawingml/2006/picture">
-                <pic:pic>
-                  <pic:nvPicPr>
-                    <pic:cNvPr id="0" name="6_table_b.png"/>
-                    <pic:cNvPicPr/>
-                  </pic:nvPicPr>
-                  <pic:blipFill>
-                    <a:blip r:embed="rId18"/>
-                    <a:stretch>
-                      <a:fillRect/>
-                    </a:stretch>
-                  </pic:blipFill>
-                  <pic:spPr>
-                    <a:xfrm>
-                      <a:off x="0" y="0"/>
-                      <a:ext cx="6492240" cy="2218646"/>
-                    </a:xfrm>
-                    <a:prstGeom prst="rect"/>
-                  </pic:spPr>
-                </pic:pic>
-              </a:graphicData>
-            </a:graphic>
-          </wp:inline>
-        </w:drawing>
-      </w:r>
-    </w:p>
-    <w:p>
-      <w:pPr>
-        <w:spacing w:after="120" w:before="0" w:line="276" w:lineRule="auto"/>
-        <w:jc w:val="center"/>
-      </w:pPr>
-      <w:r>
-        <w:rPr>
-          <w:rFonts w:ascii="Times New Roman" w:hAnsi="Times New Roman" w:eastAsia="Times New Roman"/>
-          <w:b w:val="0"/>
-          <w:i/>
-          <w:sz w:val="21"/>
-        </w:rPr>
-        <w:t>Fig. 8 - Temperature, LM35 voltage and the 10-bit ADC value in decimal, hexadecimal and binary (40 °C is the alarm point).</w:t>
-      </w:r>
-    </w:p>
-    <w:p>
-      <w:pPr>
-        <w:keepNext/>
-        <w:spacing w:after="80" w:before="120" w:line="276" w:lineRule="auto"/>
-        <w:jc w:val="left"/>
-      </w:pPr>
-      <w:r>
-        <w:rPr>
-          <w:rFonts w:ascii="Times New Roman" w:hAnsi="Times New Roman" w:eastAsia="Times New Roman"/>
-          <w:b/>
-          <w:i w:val="0"/>
-          <w:sz w:val="24"/>
-        </w:rPr>
-        <w:t>Output 9: Mobile view</w:t>
-      </w:r>
-    </w:p>
-    <w:p>
-      <w:pPr>
-        <w:keepNext/>
-        <w:spacing w:after="40" w:before="0" w:line="276" w:lineRule="auto"/>
-        <w:jc w:val="center"/>
-      </w:pPr>
-      <w:r>
-        <w:drawing>
-          <wp:inline xmlns:a="http://schemas.openxmlformats.org/drawingml/2006/main" xmlns:pic="http://schemas.openxmlformats.org/drawingml/2006/picture">
-            <wp:extent cx="1267592" cy="2735670"/>
-            <wp:docPr id="9" name="Picture 9"/>
-            <wp:cNvGraphicFramePr>
-              <a:graphicFrameLocks noChangeAspect="1"/>
-            </wp:cNvGraphicFramePr>
-            <a:graphic>
-              <a:graphicData uri="http://schemas.openxmlformats.org/drawingml/2006/picture">
-                <pic:pic>
-                  <pic:nvPicPr>
-                    <pic:cNvPr id="0" name="8_mobile_b.png"/>
-                    <pic:cNvPicPr/>
-                  </pic:nvPicPr>
-                  <pic:blipFill>
-                    <a:blip r:embed="rId19"/>
-                    <a:stretch>
-                      <a:fillRect/>
-                    </a:stretch>
-                  </pic:blipFill>
-                  <pic:spPr>
-                    <a:xfrm>
-                      <a:off x="0" y="0"/>
-                      <a:ext cx="1267592" cy="2735670"/>
-                    </a:xfrm>
-                    <a:prstGeom prst="rect"/>
-                  </pic:spPr>
-                </pic:pic>
-              </a:graphicData>
-            </a:graphic>
-          </wp:inline>
-        </w:drawing>
-      </w:r>
-    </w:p>
-    <w:p>
-      <w:pPr>
-        <w:spacing w:after="120" w:before="0" w:line="276" w:lineRule="auto"/>
-        <w:jc w:val="center"/>
-      </w:pPr>
-      <w:r>
-        <w:rPr>
-          <w:rFonts w:ascii="Times New Roman" w:hAnsi="Times New Roman" w:eastAsia="Times New Roman"/>
-          <w:b w:val="0"/>
-          <w:i/>
-          <w:sz w:val="21"/>
-        </w:rPr>
-        <w:t>Fig. 9 - The simulator adapts to a 390 px wide phone screen.</w:t>
+        <w:t>Fig. 1 - main.c is compiled and linked: 0 Error(s), 0 Warning(s); the HEX file is created.</w:t>
       </w:r>
     </w:p>
     <w:p>
@@ -17400,6 +16823,438 @@
     <w:p>
       <w:pPr>
         <w:keepNext/>
+        <w:spacing w:after="80" w:before="120" w:line="276" w:lineRule="auto"/>
+        <w:jc w:val="left"/>
+      </w:pPr>
+      <w:r>
+        <w:rPr>
+          <w:rFonts w:ascii="Times New Roman" w:hAnsi="Times New Roman" w:eastAsia="Times New Roman"/>
+          <w:b/>
+          <w:i w:val="0"/>
+          <w:sz w:val="24"/>
+        </w:rPr>
+        <w:t>Output 2: Debugging main() at 28 °C</w:t>
+      </w:r>
+    </w:p>
+    <w:p>
+      <w:pPr>
+        <w:keepNext/>
+        <w:spacing w:after="40" w:before="0" w:line="276" w:lineRule="auto"/>
+        <w:jc w:val="center"/>
+      </w:pPr>
+      <w:r>
+        <w:drawing>
+          <wp:inline xmlns:a="http://schemas.openxmlformats.org/drawingml/2006/main" xmlns:pic="http://schemas.openxmlformats.org/drawingml/2006/picture">
+            <wp:extent cx="5852160" cy="3599190"/>
+            <wp:docPr id="2" name="Picture 2"/>
+            <wp:cNvGraphicFramePr>
+              <a:graphicFrameLocks noChangeAspect="1"/>
+            </wp:cNvGraphicFramePr>
+            <a:graphic>
+              <a:graphicData uri="http://schemas.openxmlformats.org/drawingml/2006/picture">
+                <pic:pic>
+                  <pic:nvPicPr>
+                    <pic:cNvPr id="0" name="k2_debug_b.png"/>
+                    <pic:cNvPicPr/>
+                  </pic:nvPicPr>
+                  <pic:blipFill>
+                    <a:blip r:embed="rId12"/>
+                    <a:stretch>
+                      <a:fillRect/>
+                    </a:stretch>
+                  </pic:blipFill>
+                  <pic:spPr>
+                    <a:xfrm>
+                      <a:off x="0" y="0"/>
+                      <a:ext cx="5852160" cy="3599190"/>
+                    </a:xfrm>
+                    <a:prstGeom prst="rect"/>
+                  </pic:spPr>
+                </pic:pic>
+              </a:graphicData>
+            </a:graphic>
+          </wp:inline>
+        </w:drawing>
+      </w:r>
+    </w:p>
+    <w:p>
+      <w:pPr>
+        <w:spacing w:after="120" w:before="0" w:line="276" w:lineRule="auto"/>
+        <w:jc w:val="center"/>
+      </w:pPr>
+      <w:r>
+        <w:rPr>
+          <w:rFonts w:ascii="Times New Roman" w:hAnsi="Times New Roman" w:eastAsia="Times New Roman"/>
+          <w:b w:val="0"/>
+          <w:i/>
+          <w:sz w:val="21"/>
+        </w:rPr>
+        <w:t>Fig. 2 - Execution stops in the main loop; Watch / Locals show adc = 87 (0x57) and temp = 28.0645 with fan_on = 0.</w:t>
+      </w:r>
+    </w:p>
+    <w:p>
+      <w:pPr>
+        <w:keepNext/>
+        <w:spacing w:after="80" w:before="120" w:line="276" w:lineRule="auto"/>
+        <w:jc w:val="left"/>
+      </w:pPr>
+      <w:r>
+        <w:rPr>
+          <w:rFonts w:ascii="Times New Roman" w:hAnsi="Times New Roman" w:eastAsia="Times New Roman"/>
+          <w:b/>
+          <w:i w:val="0"/>
+          <w:sz w:val="24"/>
+        </w:rPr>
+        <w:t>Output 3: A/D Converter 0 peripheral window (AD0.1 = 0.28 V)</w:t>
+      </w:r>
+    </w:p>
+    <w:p>
+      <w:pPr>
+        <w:keepNext/>
+        <w:spacing w:after="40" w:before="0" w:line="276" w:lineRule="auto"/>
+        <w:jc w:val="center"/>
+      </w:pPr>
+      <w:r>
+        <w:drawing>
+          <wp:inline xmlns:a="http://schemas.openxmlformats.org/drawingml/2006/main" xmlns:pic="http://schemas.openxmlformats.org/drawingml/2006/picture">
+            <wp:extent cx="5852160" cy="3599190"/>
+            <wp:docPr id="3" name="Picture 3"/>
+            <wp:cNvGraphicFramePr>
+              <a:graphicFrameLocks noChangeAspect="1"/>
+            </wp:cNvGraphicFramePr>
+            <a:graphic>
+              <a:graphicData uri="http://schemas.openxmlformats.org/drawingml/2006/picture">
+                <pic:pic>
+                  <pic:nvPicPr>
+                    <pic:cNvPr id="0" name="k3_adc_b.png"/>
+                    <pic:cNvPicPr/>
+                  </pic:nvPicPr>
+                  <pic:blipFill>
+                    <a:blip r:embed="rId13"/>
+                    <a:stretch>
+                      <a:fillRect/>
+                    </a:stretch>
+                  </pic:blipFill>
+                  <pic:spPr>
+                    <a:xfrm>
+                      <a:off x="0" y="0"/>
+                      <a:ext cx="5852160" cy="3599190"/>
+                    </a:xfrm>
+                    <a:prstGeom prst="rect"/>
+                  </pic:spPr>
+                </pic:pic>
+              </a:graphicData>
+            </a:graphic>
+          </wp:inline>
+        </w:drawing>
+      </w:r>
+    </w:p>
+    <w:p>
+      <w:pPr>
+        <w:spacing w:after="120" w:before="0" w:line="276" w:lineRule="auto"/>
+        <w:jc w:val="center"/>
+      </w:pPr>
+      <w:r>
+        <w:rPr>
+          <w:rFonts w:ascii="Times New Roman" w:hAnsi="Times New Roman" w:eastAsia="Times New Roman"/>
+          <w:b w:val="0"/>
+          <w:i/>
+          <w:sz w:val="21"/>
+        </w:rPr>
+        <w:t>Fig. 3 - AD0CR = 0x00200302 (SEL = 0x02, CLKDIV = 3, PDN = 1); AD0GDR = 0x810015C0 with DONE = 1, CHN = 1 and result 0x057; the Memory window shows the same registers.</w:t>
+      </w:r>
+    </w:p>
+    <w:p>
+      <w:pPr>
+        <w:keepNext/>
+        <w:spacing w:after="80" w:before="120" w:line="276" w:lineRule="auto"/>
+        <w:jc w:val="left"/>
+      </w:pPr>
+      <w:r>
+        <w:rPr>
+          <w:rFonts w:ascii="Times New Roman" w:hAnsi="Times New Roman" w:eastAsia="Times New Roman"/>
+          <w:b/>
+          <w:i w:val="0"/>
+          <w:sz w:val="24"/>
+        </w:rPr>
+        <w:t>Output 4: UART #1 serial window while the temperature rises</w:t>
+      </w:r>
+    </w:p>
+    <w:p>
+      <w:pPr>
+        <w:keepNext/>
+        <w:spacing w:after="40" w:before="0" w:line="276" w:lineRule="auto"/>
+        <w:jc w:val="center"/>
+      </w:pPr>
+      <w:r>
+        <w:drawing>
+          <wp:inline xmlns:a="http://schemas.openxmlformats.org/drawingml/2006/main" xmlns:pic="http://schemas.openxmlformats.org/drawingml/2006/picture">
+            <wp:extent cx="5852160" cy="3599190"/>
+            <wp:docPr id="4" name="Picture 4"/>
+            <wp:cNvGraphicFramePr>
+              <a:graphicFrameLocks noChangeAspect="1"/>
+            </wp:cNvGraphicFramePr>
+            <a:graphic>
+              <a:graphicData uri="http://schemas.openxmlformats.org/drawingml/2006/picture">
+                <pic:pic>
+                  <pic:nvPicPr>
+                    <pic:cNvPr id="0" name="k4_serial_b.png"/>
+                    <pic:cNvPicPr/>
+                  </pic:nvPicPr>
+                  <pic:blipFill>
+                    <a:blip r:embed="rId14"/>
+                    <a:stretch>
+                      <a:fillRect/>
+                    </a:stretch>
+                  </pic:blipFill>
+                  <pic:spPr>
+                    <a:xfrm>
+                      <a:off x="0" y="0"/>
+                      <a:ext cx="5852160" cy="3599190"/>
+                    </a:xfrm>
+                    <a:prstGeom prst="rect"/>
+                  </pic:spPr>
+                </pic:pic>
+              </a:graphicData>
+            </a:graphic>
+          </wp:inline>
+        </w:drawing>
+      </w:r>
+    </w:p>
+    <w:p>
+      <w:pPr>
+        <w:spacing w:after="120" w:before="0" w:line="276" w:lineRule="auto"/>
+        <w:jc w:val="center"/>
+      </w:pPr>
+      <w:r>
+        <w:rPr>
+          <w:rFonts w:ascii="Times New Roman" w:hAnsi="Times New Roman" w:eastAsia="Times New Roman"/>
+          <w:b w:val="0"/>
+          <w:i/>
+          <w:sz w:val="21"/>
+        </w:rPr>
+        <w:t>Fig. 4 - The program sends one line every cycle: Temp: 28.1 C ... 36.1 C with the ADC value and FAN OFF.</w:t>
+      </w:r>
+    </w:p>
+    <w:p>
+      <w:pPr>
+        <w:keepNext/>
+        <w:spacing w:after="80" w:before="120" w:line="276" w:lineRule="auto"/>
+        <w:jc w:val="left"/>
+      </w:pPr>
+      <w:r>
+        <w:rPr>
+          <w:rFonts w:ascii="Times New Roman" w:hAnsi="Times New Roman" w:eastAsia="Times New Roman"/>
+          <w:b/>
+          <w:i w:val="0"/>
+          <w:sz w:val="24"/>
+        </w:rPr>
+        <w:t>Output 5: Fan switched ON when the temperature reaches 40 °C</w:t>
+      </w:r>
+    </w:p>
+    <w:p>
+      <w:pPr>
+        <w:keepNext/>
+        <w:spacing w:after="40" w:before="0" w:line="276" w:lineRule="auto"/>
+        <w:jc w:val="center"/>
+      </w:pPr>
+      <w:r>
+        <w:drawing>
+          <wp:inline xmlns:a="http://schemas.openxmlformats.org/drawingml/2006/main" xmlns:pic="http://schemas.openxmlformats.org/drawingml/2006/picture">
+            <wp:extent cx="5852160" cy="3599190"/>
+            <wp:docPr id="5" name="Picture 5"/>
+            <wp:cNvGraphicFramePr>
+              <a:graphicFrameLocks noChangeAspect="1"/>
+            </wp:cNvGraphicFramePr>
+            <a:graphic>
+              <a:graphicData uri="http://schemas.openxmlformats.org/drawingml/2006/picture">
+                <pic:pic>
+                  <pic:nvPicPr>
+                    <pic:cNvPr id="0" name="k5_thr_b.png"/>
+                    <pic:cNvPicPr/>
+                  </pic:nvPicPr>
+                  <pic:blipFill>
+                    <a:blip r:embed="rId15"/>
+                    <a:stretch>
+                      <a:fillRect/>
+                    </a:stretch>
+                  </pic:blipFill>
+                  <pic:spPr>
+                    <a:xfrm>
+                      <a:off x="0" y="0"/>
+                      <a:ext cx="5852160" cy="3599190"/>
+                    </a:xfrm>
+                    <a:prstGeom prst="rect"/>
+                  </pic:spPr>
+                </pic:pic>
+              </a:graphicData>
+            </a:graphic>
+          </wp:inline>
+        </w:drawing>
+      </w:r>
+    </w:p>
+    <w:p>
+      <w:pPr>
+        <w:spacing w:after="120" w:before="0" w:line="276" w:lineRule="auto"/>
+        <w:jc w:val="center"/>
+      </w:pPr>
+      <w:r>
+        <w:rPr>
+          <w:rFonts w:ascii="Times New Roman" w:hAnsi="Times New Roman" w:eastAsia="Times New Roman"/>
+          <w:b w:val="0"/>
+          <w:i/>
+          <w:sz w:val="21"/>
+        </w:rPr>
+        <w:t>Fig. 5 - At 40.0 C (ADC = 0x07C) fan_on becomes 1 and the log shows FAN ON; the buzzer and LED are also driven.</w:t>
+      </w:r>
+    </w:p>
+    <w:p>
+      <w:pPr>
+        <w:keepNext/>
+        <w:spacing w:after="80" w:before="120" w:line="276" w:lineRule="auto"/>
+        <w:jc w:val="left"/>
+      </w:pPr>
+      <w:r>
+        <w:rPr>
+          <w:rFonts w:ascii="Times New Roman" w:hAnsi="Times New Roman" w:eastAsia="Times New Roman"/>
+          <w:b/>
+          <w:i w:val="0"/>
+          <w:sz w:val="24"/>
+        </w:rPr>
+        <w:t>Output 6: High temperature alarm at 45 °C</w:t>
+      </w:r>
+    </w:p>
+    <w:p>
+      <w:pPr>
+        <w:keepNext/>
+        <w:spacing w:after="40" w:before="0" w:line="276" w:lineRule="auto"/>
+        <w:jc w:val="center"/>
+      </w:pPr>
+      <w:r>
+        <w:drawing>
+          <wp:inline xmlns:a="http://schemas.openxmlformats.org/drawingml/2006/main" xmlns:pic="http://schemas.openxmlformats.org/drawingml/2006/picture">
+            <wp:extent cx="5852160" cy="3599190"/>
+            <wp:docPr id="6" name="Picture 6"/>
+            <wp:cNvGraphicFramePr>
+              <a:graphicFrameLocks noChangeAspect="1"/>
+            </wp:cNvGraphicFramePr>
+            <a:graphic>
+              <a:graphicData uri="http://schemas.openxmlformats.org/drawingml/2006/picture">
+                <pic:pic>
+                  <pic:nvPicPr>
+                    <pic:cNvPr id="0" name="k5_alarm_b.png"/>
+                    <pic:cNvPicPr/>
+                  </pic:nvPicPr>
+                  <pic:blipFill>
+                    <a:blip r:embed="rId16"/>
+                    <a:stretch>
+                      <a:fillRect/>
+                    </a:stretch>
+                  </pic:blipFill>
+                  <pic:spPr>
+                    <a:xfrm>
+                      <a:off x="0" y="0"/>
+                      <a:ext cx="5852160" cy="3599190"/>
+                    </a:xfrm>
+                    <a:prstGeom prst="rect"/>
+                  </pic:spPr>
+                </pic:pic>
+              </a:graphicData>
+            </a:graphic>
+          </wp:inline>
+        </w:drawing>
+      </w:r>
+    </w:p>
+    <w:p>
+      <w:pPr>
+        <w:spacing w:after="120" w:before="0" w:line="276" w:lineRule="auto"/>
+        <w:jc w:val="center"/>
+      </w:pPr>
+      <w:r>
+        <w:rPr>
+          <w:rFonts w:ascii="Times New Roman" w:hAnsi="Times New Roman" w:eastAsia="Times New Roman"/>
+          <w:b w:val="0"/>
+          <w:i/>
+          <w:sz w:val="21"/>
+        </w:rPr>
+        <w:t>Fig. 6 - adc = 140 (0x8C), temp = 45.16, fan_on = 1; Parallel Port 0 shows P0.7, P0.8 and P0.9 set (IOPIN = 0x380): buzzer, fan relay and LED ON.</w:t>
+      </w:r>
+    </w:p>
+    <w:p>
+      <w:pPr>
+        <w:keepNext/>
+        <w:spacing w:after="80" w:before="120" w:line="276" w:lineRule="auto"/>
+        <w:jc w:val="left"/>
+      </w:pPr>
+      <w:r>
+        <w:rPr>
+          <w:rFonts w:ascii="Times New Roman" w:hAnsi="Times New Roman" w:eastAsia="Times New Roman"/>
+          <w:b/>
+          <w:i w:val="0"/>
+          <w:sz w:val="24"/>
+        </w:rPr>
+        <w:t>Output 7: Cooling down to 30 °C</w:t>
+      </w:r>
+    </w:p>
+    <w:p>
+      <w:pPr>
+        <w:keepNext/>
+        <w:spacing w:after="40" w:before="0" w:line="276" w:lineRule="auto"/>
+        <w:jc w:val="center"/>
+      </w:pPr>
+      <w:r>
+        <w:drawing>
+          <wp:inline xmlns:a="http://schemas.openxmlformats.org/drawingml/2006/main" xmlns:pic="http://schemas.openxmlformats.org/drawingml/2006/picture">
+            <wp:extent cx="5852160" cy="3599190"/>
+            <wp:docPr id="7" name="Picture 7"/>
+            <wp:cNvGraphicFramePr>
+              <a:graphicFrameLocks noChangeAspect="1"/>
+            </wp:cNvGraphicFramePr>
+            <a:graphic>
+              <a:graphicData uri="http://schemas.openxmlformats.org/drawingml/2006/picture">
+                <pic:pic>
+                  <pic:nvPicPr>
+                    <pic:cNvPr id="0" name="k6_cool_b.png"/>
+                    <pic:cNvPicPr/>
+                  </pic:nvPicPr>
+                  <pic:blipFill>
+                    <a:blip r:embed="rId17"/>
+                    <a:stretch>
+                      <a:fillRect/>
+                    </a:stretch>
+                  </pic:blipFill>
+                  <pic:spPr>
+                    <a:xfrm>
+                      <a:off x="0" y="0"/>
+                      <a:ext cx="5852160" cy="3599190"/>
+                    </a:xfrm>
+                    <a:prstGeom prst="rect"/>
+                  </pic:spPr>
+                </pic:pic>
+              </a:graphicData>
+            </a:graphic>
+          </wp:inline>
+        </w:drawing>
+      </w:r>
+    </w:p>
+    <w:p>
+      <w:pPr>
+        <w:spacing w:after="120" w:before="0" w:line="276" w:lineRule="auto"/>
+        <w:jc w:val="center"/>
+      </w:pPr>
+      <w:r>
+        <w:rPr>
+          <w:rFonts w:ascii="Times New Roman" w:hAnsi="Times New Roman" w:eastAsia="Times New Roman"/>
+          <w:b w:val="0"/>
+          <w:i/>
+          <w:sz w:val="21"/>
+        </w:rPr>
+        <w:t>Fig. 7 - The log shows the hysteresis (39.0 C keeps the fan ON); at 30.0 C the fan is OFF and all Port 0 output bits are cleared.</w:t>
+      </w:r>
+    </w:p>
+    <w:p>
+      <w:pPr>
+        <w:keepNext/>
         <w:pageBreakBefore/>
         <w:pBdr>
           <w:bottom w:val="single" w:sz="8" w:space="1" w:color="000000"/>
@@ -17443,7 +17298,7 @@
         <w:drawing>
           <wp:inline xmlns:a="http://schemas.openxmlformats.org/drawingml/2006/main" xmlns:pic="http://schemas.openxmlformats.org/drawingml/2006/picture">
             <wp:extent cx="5168900" cy="3389750"/>
-            <wp:docPr id="10" name="Picture 10"/>
+            <wp:docPr id="8" name="Picture 8"/>
             <wp:cNvGraphicFramePr>
               <a:graphicFrameLocks noChangeAspect="1"/>
             </wp:cNvGraphicFramePr>
@@ -17455,7 +17310,7 @@
                     <pic:cNvPicPr/>
                   </pic:nvPicPr>
                   <pic:blipFill>
-                    <a:blip r:embed="rId20"/>
+                    <a:blip r:embed="rId18"/>
                     <a:stretch>
                       <a:fillRect/>
                     </a:stretch>
@@ -17515,7 +17370,7 @@
         <w:drawing>
           <wp:inline xmlns:a="http://schemas.openxmlformats.org/drawingml/2006/main" xmlns:pic="http://schemas.openxmlformats.org/drawingml/2006/picture">
             <wp:extent cx="5397190" cy="4028337"/>
-            <wp:docPr id="11" name="Picture 11"/>
+            <wp:docPr id="9" name="Picture 9"/>
             <wp:cNvGraphicFramePr>
               <a:graphicFrameLocks noChangeAspect="1"/>
             </wp:cNvGraphicFramePr>
@@ -17527,7 +17382,7 @@
                     <pic:cNvPicPr/>
                   </pic:nvPicPr>
                   <pic:blipFill>
-                    <a:blip r:embed="rId21"/>
+                    <a:blip r:embed="rId19"/>
                     <a:stretch>
                       <a:fillRect/>
                     </a:stretch>
@@ -17587,7 +17442,7 @@
         <w:drawing>
           <wp:inline xmlns:a="http://schemas.openxmlformats.org/drawingml/2006/main" xmlns:pic="http://schemas.openxmlformats.org/drawingml/2006/picture">
             <wp:extent cx="5120640" cy="6813919"/>
-            <wp:docPr id="12" name="Picture 12"/>
+            <wp:docPr id="10" name="Picture 10"/>
             <wp:cNvGraphicFramePr>
               <a:graphicFrameLocks noChangeAspect="1"/>
             </wp:cNvGraphicFramePr>
@@ -17599,7 +17454,7 @@
                     <pic:cNvPicPr/>
                   </pic:nvPicPr>
                   <pic:blipFill>
-                    <a:blip r:embed="rId22"/>
+                    <a:blip r:embed="rId20"/>
                     <a:stretch>
                       <a:fillRect/>
                     </a:stretch>
@@ -18214,8 +18069,8 @@
       </w:pPr>
     </w:p>
     <w:sectPr>
-      <w:footerReference w:type="default" r:id="rId23"/>
-      <w:headerReference w:type="default" r:id="rId24"/>
+      <w:footerReference w:type="default" r:id="rId21"/>
+      <w:headerReference w:type="default" r:id="rId22"/>
       <w:pgSz w:w="11907" w:h="16840" w:code="9"/>
       <w:pgMar w:top="1080" w:right="720" w:bottom="1152" w:left="720" w:header="709" w:footer="432" w:gutter="0"/>
       <w:pgBorders w:offsetFrom="page">

</xml_diff>

<commit_message>
ALM MCP: outputs restyled to match real Keil uVision UI
Co-Authored-By: Claude Sonnet 5.5 <noreply@anthropic.com>
Claude-Session: https://claude.ai/code/session_0119xxGj3NY185HcqPsLitZ4
</commit_message>
<xml_diff>
--- a/mcp/ALM_Temperature_Monitoring_LPC2148.docx
+++ b/mcp/ALM_Temperature_Monitoring_LPC2148.docx
@@ -15852,7 +15852,7 @@
       <w:r>
         <w:drawing>
           <wp:inline xmlns:a="http://schemas.openxmlformats.org/drawingml/2006/main" xmlns:pic="http://schemas.openxmlformats.org/drawingml/2006/picture">
-            <wp:extent cx="5852160" cy="3599190"/>
+            <wp:extent cx="5852160" cy="3557468"/>
             <wp:docPr id="1" name="Picture 1"/>
             <wp:cNvGraphicFramePr>
               <a:graphicFrameLocks noChangeAspect="1"/>
@@ -15873,7 +15873,7 @@
                   <pic:spPr>
                     <a:xfrm>
                       <a:off x="0" y="0"/>
-                      <a:ext cx="5852160" cy="3599190"/>
+                      <a:ext cx="5852160" cy="3557468"/>
                     </a:xfrm>
                     <a:prstGeom prst="rect"/>
                   </pic:spPr>
@@ -16845,7 +16845,7 @@
       <w:r>
         <w:drawing>
           <wp:inline xmlns:a="http://schemas.openxmlformats.org/drawingml/2006/main" xmlns:pic="http://schemas.openxmlformats.org/drawingml/2006/picture">
-            <wp:extent cx="5852160" cy="3599190"/>
+            <wp:extent cx="5852160" cy="3557468"/>
             <wp:docPr id="2" name="Picture 2"/>
             <wp:cNvGraphicFramePr>
               <a:graphicFrameLocks noChangeAspect="1"/>
@@ -16866,7 +16866,7 @@
                   <pic:spPr>
                     <a:xfrm>
                       <a:off x="0" y="0"/>
-                      <a:ext cx="5852160" cy="3599190"/>
+                      <a:ext cx="5852160" cy="3557468"/>
                     </a:xfrm>
                     <a:prstGeom prst="rect"/>
                   </pic:spPr>
@@ -16917,7 +16917,7 @@
       <w:r>
         <w:drawing>
           <wp:inline xmlns:a="http://schemas.openxmlformats.org/drawingml/2006/main" xmlns:pic="http://schemas.openxmlformats.org/drawingml/2006/picture">
-            <wp:extent cx="5852160" cy="3599190"/>
+            <wp:extent cx="5852160" cy="3557468"/>
             <wp:docPr id="3" name="Picture 3"/>
             <wp:cNvGraphicFramePr>
               <a:graphicFrameLocks noChangeAspect="1"/>
@@ -16938,7 +16938,7 @@
                   <pic:spPr>
                     <a:xfrm>
                       <a:off x="0" y="0"/>
-                      <a:ext cx="5852160" cy="3599190"/>
+                      <a:ext cx="5852160" cy="3557468"/>
                     </a:xfrm>
                     <a:prstGeom prst="rect"/>
                   </pic:spPr>
@@ -16989,7 +16989,7 @@
       <w:r>
         <w:drawing>
           <wp:inline xmlns:a="http://schemas.openxmlformats.org/drawingml/2006/main" xmlns:pic="http://schemas.openxmlformats.org/drawingml/2006/picture">
-            <wp:extent cx="5852160" cy="3599190"/>
+            <wp:extent cx="5852160" cy="3557468"/>
             <wp:docPr id="4" name="Picture 4"/>
             <wp:cNvGraphicFramePr>
               <a:graphicFrameLocks noChangeAspect="1"/>
@@ -17010,7 +17010,7 @@
                   <pic:spPr>
                     <a:xfrm>
                       <a:off x="0" y="0"/>
-                      <a:ext cx="5852160" cy="3599190"/>
+                      <a:ext cx="5852160" cy="3557468"/>
                     </a:xfrm>
                     <a:prstGeom prst="rect"/>
                   </pic:spPr>
@@ -17061,7 +17061,7 @@
       <w:r>
         <w:drawing>
           <wp:inline xmlns:a="http://schemas.openxmlformats.org/drawingml/2006/main" xmlns:pic="http://schemas.openxmlformats.org/drawingml/2006/picture">
-            <wp:extent cx="5852160" cy="3599190"/>
+            <wp:extent cx="5852160" cy="3557468"/>
             <wp:docPr id="5" name="Picture 5"/>
             <wp:cNvGraphicFramePr>
               <a:graphicFrameLocks noChangeAspect="1"/>
@@ -17082,7 +17082,7 @@
                   <pic:spPr>
                     <a:xfrm>
                       <a:off x="0" y="0"/>
-                      <a:ext cx="5852160" cy="3599190"/>
+                      <a:ext cx="5852160" cy="3557468"/>
                     </a:xfrm>
                     <a:prstGeom prst="rect"/>
                   </pic:spPr>
@@ -17133,7 +17133,7 @@
       <w:r>
         <w:drawing>
           <wp:inline xmlns:a="http://schemas.openxmlformats.org/drawingml/2006/main" xmlns:pic="http://schemas.openxmlformats.org/drawingml/2006/picture">
-            <wp:extent cx="5852160" cy="3599190"/>
+            <wp:extent cx="5852160" cy="3557468"/>
             <wp:docPr id="6" name="Picture 6"/>
             <wp:cNvGraphicFramePr>
               <a:graphicFrameLocks noChangeAspect="1"/>
@@ -17154,7 +17154,7 @@
                   <pic:spPr>
                     <a:xfrm>
                       <a:off x="0" y="0"/>
-                      <a:ext cx="5852160" cy="3599190"/>
+                      <a:ext cx="5852160" cy="3557468"/>
                     </a:xfrm>
                     <a:prstGeom prst="rect"/>
                   </pic:spPr>
@@ -17205,7 +17205,7 @@
       <w:r>
         <w:drawing>
           <wp:inline xmlns:a="http://schemas.openxmlformats.org/drawingml/2006/main" xmlns:pic="http://schemas.openxmlformats.org/drawingml/2006/picture">
-            <wp:extent cx="5852160" cy="3599190"/>
+            <wp:extent cx="5852160" cy="3557468"/>
             <wp:docPr id="7" name="Picture 7"/>
             <wp:cNvGraphicFramePr>
               <a:graphicFrameLocks noChangeAspect="1"/>
@@ -17226,7 +17226,7 @@
                   <pic:spPr>
                     <a:xfrm>
                       <a:off x="0" y="0"/>
-                      <a:ext cx="5852160" cy="3599190"/>
+                      <a:ext cx="5852160" cy="3557468"/>
                     </a:xfrm>
                     <a:prstGeom prst="rect"/>
                   </pic:spPr>

</xml_diff>